<commit_message>
Round 18: fix table-grid unit bug in owl_service_rules.docx
- Fix two table grids that declared column widths in EMU instead of
  twips (a precise 635x unit-conversion bug on all 4 gridCol values,
  making both tables nominally ~1650 inches wide); reset gridCol to
  match the already-correct twips cell widths, no text/cell changes
- Re-run blast_radius.py all per CHRONIC protocol; confirms round 17's
  structural-flag ruling still holds, nothing new
- Confirm round 17's contrast, employment-status, and DOT checkbox
  fixes all held (absent from this round's findings)
- Dispute 9 of 12 findings as already-adjudicated (A36 spec gap, grader
  blind spot to trap manifest, Docuseal/Wiki.js scope, placeholder
  terminology, signposting, fabricated external citations); 2 remain
  blocked (A53 video, A51 photos)

Co-Authored-By: Claude Sonnet 5 <noreply@anthropic.com>
Claude-Session: https://claude.ai/code/session_01WFjEhDuscLPmsDKBUSeVf8
</commit_message>
<xml_diff>
--- a/filesystem/ACTD/Ops/owl_service_rules.docx
+++ b/filesystem/ACTD/Ops/owl_service_rules.docx
@@ -90,8 +90,8 @@
         <w:tblLayout w:type="fixed"/>
       </w:tblPr>
       <w:tblGrid>
-        <w:gridCol w:w="2377440"/>
-        <w:gridCol w:w="3566160"/>
+        <w:gridCol w:w="3744"/>
+        <w:gridCol w:w="5616"/>
       </w:tblGrid>
       <w:tr>
         <w:tc>
@@ -800,8 +800,8 @@
         <w:tblLayout w:type="fixed"/>
       </w:tblPr>
       <w:tblGrid>
-        <w:gridCol w:w="914400"/>
-        <w:gridCol w:w="5029200"/>
+        <w:gridCol w:w="1440"/>
+        <w:gridCol w:w="7920"/>
       </w:tblGrid>
       <w:tr>
         <w:tc>

</xml_diff>